<commit_message>
docs(erp): real screenshots + Arabic UI in manuals; fix USD FX rate
- Add scripts/capture_screens.py (Playwright/Chromium) to capture real
  EN/AR screenshots deep-linked into the actual demo records.
- build_manual.py: embed numbered figures + worked examples (PO P00002,
  SO S00001 -> INV/2026/00001); add *italic* rendering; Tajawal in AR DOCX.
- Install bilingual UI (ar_001); Arabic screenshots show the Arabic UI.
- Fix inverted USD exchange rate in seed (store rate=1/N so 1 USD = N SDG;
  $1,288 now values at 901,600 SDG, was 1.84); set company to
  Sudan MedSupply Co. (Khartoum, Sudan).
- Regenerate EN/AR DOCX + PDF with embedded screenshots.
- Update README ERP section and erp-medsupply-demo runbook skill.

Co-Authored-By: Claude Opus 4.8 <noreply@anthropic.com>
</commit_message>
<xml_diff>
--- a/docs/manual/Medical-Supply_ERP_User_Manual_EN.docx
+++ b/docs/manual/Medical-Supply_ERP_User_Manual_EN.docx
@@ -91,7 +91,7 @@
           <w:sz w:val="24"/>
           <w:rFonts w:cs="Calibri" w:ascii="Calibri" w:hAnsi="Calibri"/>
         </w:rPr>
-        <w:t>Version 1.0  •  June 2026</w:t>
+        <w:t>Version 2.0  •  June 2026</w:t>
       </w:r>
     </w:p>
     <w:p>
@@ -875,6 +875,60 @@
         <w:t xml:space="preserve"> on the demo database — change this password before going live.</w:t>
       </w:r>
     </w:p>
+    <w:p>
+      <w:pPr>
+        <w:jc w:val="center"/>
+      </w:pPr>
+      <w:r>
+        <w:drawing>
+          <wp:inline xmlns:a="http://schemas.openxmlformats.org/drawingml/2006/main" xmlns:pic="http://schemas.openxmlformats.org/drawingml/2006/picture">
+            <wp:extent cx="5577840" cy="3542682"/>
+            <wp:docPr id="1" name="Picture 1"/>
+            <wp:cNvGraphicFramePr>
+              <a:graphicFrameLocks noChangeAspect="1"/>
+            </wp:cNvGraphicFramePr>
+            <a:graphic>
+              <a:graphicData uri="http://schemas.openxmlformats.org/drawingml/2006/picture">
+                <pic:pic>
+                  <pic:nvPicPr>
+                    <pic:cNvPr id="0" name="login.png"/>
+                    <pic:cNvPicPr/>
+                  </pic:nvPicPr>
+                  <pic:blipFill>
+                    <a:blip r:embed="rId10"/>
+                    <a:stretch>
+                      <a:fillRect/>
+                    </a:stretch>
+                  </pic:blipFill>
+                  <pic:spPr>
+                    <a:xfrm>
+                      <a:off x="0" y="0"/>
+                      <a:ext cx="5577840" cy="3542682"/>
+                    </a:xfrm>
+                    <a:prstGeom prst="rect"/>
+                  </pic:spPr>
+                </pic:pic>
+              </a:graphicData>
+            </a:graphic>
+          </wp:inline>
+        </w:drawing>
+      </w:r>
+    </w:p>
+    <w:p>
+      <w:pPr>
+        <w:jc w:val="center"/>
+      </w:pPr>
+      <w:r>
+        <w:rPr>
+          <w:i/>
+          <w:color w:val="555555"/>
+          <w:sz w:val="19"/>
+          <w:rFonts w:cs="Calibri" w:ascii="Calibri" w:hAnsi="Calibri"/>
+        </w:rPr>
+        <w:t>Figure 1 — The sign-in screen — choose the **erpmedsupply** database and log in.</w:t>
+      </w:r>
+    </w:p>
+    <w:p/>
     <w:tbl>
       <w:tblPr>
         <w:tblW w:type="auto" w:w="0"/>
@@ -1008,6 +1062,60 @@
       </w:r>
     </w:p>
     <w:p>
+      <w:pPr>
+        <w:jc w:val="center"/>
+      </w:pPr>
+      <w:r>
+        <w:drawing>
+          <wp:inline xmlns:a="http://schemas.openxmlformats.org/drawingml/2006/main" xmlns:pic="http://schemas.openxmlformats.org/drawingml/2006/picture">
+            <wp:extent cx="5577840" cy="3542682"/>
+            <wp:docPr id="2" name="Picture 2"/>
+            <wp:cNvGraphicFramePr>
+              <a:graphicFrameLocks noChangeAspect="1"/>
+            </wp:cNvGraphicFramePr>
+            <a:graphic>
+              <a:graphicData uri="http://schemas.openxmlformats.org/drawingml/2006/picture">
+                <pic:pic>
+                  <pic:nvPicPr>
+                    <pic:cNvPr id="0" name="apps_home.png"/>
+                    <pic:cNvPicPr/>
+                  </pic:nvPicPr>
+                  <pic:blipFill>
+                    <a:blip r:embed="rId11"/>
+                    <a:stretch>
+                      <a:fillRect/>
+                    </a:stretch>
+                  </pic:blipFill>
+                  <pic:spPr>
+                    <a:xfrm>
+                      <a:off x="0" y="0"/>
+                      <a:ext cx="5577840" cy="3542682"/>
+                    </a:xfrm>
+                    <a:prstGeom prst="rect"/>
+                  </pic:spPr>
+                </pic:pic>
+              </a:graphicData>
+            </a:graphic>
+          </wp:inline>
+        </w:drawing>
+      </w:r>
+    </w:p>
+    <w:p>
+      <w:pPr>
+        <w:jc w:val="center"/>
+      </w:pPr>
+      <w:r>
+        <w:rPr>
+          <w:i/>
+          <w:color w:val="555555"/>
+          <w:sz w:val="19"/>
+          <w:rFonts w:cs="Calibri" w:ascii="Calibri" w:hAnsi="Calibri"/>
+        </w:rPr>
+        <w:t>Figure 2 — The applications home screen, showing the installed business apps.</w:t>
+      </w:r>
+    </w:p>
+    <w:p/>
+    <w:p>
       <w:r>
         <w:br w:type="page"/>
       </w:r>
@@ -1446,6 +1554,60 @@
         </w:tc>
       </w:tr>
     </w:tbl>
+    <w:p/>
+    <w:p>
+      <w:pPr>
+        <w:jc w:val="center"/>
+      </w:pPr>
+      <w:r>
+        <w:drawing>
+          <wp:inline xmlns:a="http://schemas.openxmlformats.org/drawingml/2006/main" xmlns:pic="http://schemas.openxmlformats.org/drawingml/2006/picture">
+            <wp:extent cx="5577840" cy="3542682"/>
+            <wp:docPr id="3" name="Picture 3"/>
+            <wp:cNvGraphicFramePr>
+              <a:graphicFrameLocks noChangeAspect="1"/>
+            </wp:cNvGraphicFramePr>
+            <a:graphic>
+              <a:graphicData uri="http://schemas.openxmlformats.org/drawingml/2006/picture">
+                <pic:pic>
+                  <pic:nvPicPr>
+                    <pic:cNvPr id="0" name="currency_rates.png"/>
+                    <pic:cNvPicPr/>
+                  </pic:nvPicPr>
+                  <pic:blipFill>
+                    <a:blip r:embed="rId12"/>
+                    <a:stretch>
+                      <a:fillRect/>
+                    </a:stretch>
+                  </pic:blipFill>
+                  <pic:spPr>
+                    <a:xfrm>
+                      <a:off x="0" y="0"/>
+                      <a:ext cx="5577840" cy="3542682"/>
+                    </a:xfrm>
+                    <a:prstGeom prst="rect"/>
+                  </pic:spPr>
+                </pic:pic>
+              </a:graphicData>
+            </a:graphic>
+          </wp:inline>
+        </w:drawing>
+      </w:r>
+    </w:p>
+    <w:p>
+      <w:pPr>
+        <w:jc w:val="center"/>
+      </w:pPr>
+      <w:r>
+        <w:rPr>
+          <w:i/>
+          <w:color w:val="555555"/>
+          <w:sz w:val="19"/>
+          <w:rFonts w:cs="Calibri" w:ascii="Calibri" w:hAnsi="Calibri"/>
+        </w:rPr>
+        <w:t>Figure 3 — The USD currency record with its dated rate history (1 USD = 600 → 700 SDG). Type the rate into the **SDG per Unit** column.</w:t>
+      </w:r>
+    </w:p>
     <w:p/>
     <w:tbl>
       <w:tblPr>
@@ -1802,97 +1964,127 @@
     <w:p/>
     <w:p>
       <w:pPr>
-        <w:pStyle w:val="Heading2"/>
-      </w:pPr>
-      <w:r>
-        <w:rPr>
-          <w:rFonts w:cs="Calibri" w:ascii="Calibri" w:hAnsi="Calibri"/>
-        </w:rPr>
-        <w:t>3.4 Banks and money safes</w:t>
+        <w:jc w:val="center"/>
+      </w:pPr>
+      <w:r>
+        <w:drawing>
+          <wp:inline xmlns:a="http://schemas.openxmlformats.org/drawingml/2006/main" xmlns:pic="http://schemas.openxmlformats.org/drawingml/2006/picture">
+            <wp:extent cx="5577840" cy="3542682"/>
+            <wp:docPr id="4" name="Picture 4"/>
+            <wp:cNvGraphicFramePr>
+              <a:graphicFrameLocks noChangeAspect="1"/>
+            </wp:cNvGraphicFramePr>
+            <a:graphic>
+              <a:graphicData uri="http://schemas.openxmlformats.org/drawingml/2006/picture">
+                <pic:pic>
+                  <pic:nvPicPr>
+                    <pic:cNvPr id="0" name="contacts.png"/>
+                    <pic:cNvPicPr/>
+                  </pic:nvPicPr>
+                  <pic:blipFill>
+                    <a:blip r:embed="rId13"/>
+                    <a:stretch>
+                      <a:fillRect/>
+                    </a:stretch>
+                  </pic:blipFill>
+                  <pic:spPr>
+                    <a:xfrm>
+                      <a:off x="0" y="0"/>
+                      <a:ext cx="5577840" cy="3542682"/>
+                    </a:xfrm>
+                    <a:prstGeom prst="rect"/>
+                  </pic:spPr>
+                </pic:pic>
+              </a:graphicData>
+            </a:graphic>
+          </wp:inline>
+        </w:drawing>
       </w:r>
     </w:p>
     <w:p>
-      <w:r>
-        <w:rPr>
-          <w:rFonts w:cs="Calibri" w:ascii="Calibri" w:hAnsi="Calibri"/>
-        </w:rPr>
-        <w:t xml:space="preserve">Money flows are tracked through </w:t>
-      </w:r>
-      <w:r>
-        <w:rPr>
-          <w:b/>
-          <w:rFonts w:cs="Calibri" w:ascii="Calibri" w:hAnsi="Calibri"/>
-        </w:rPr>
-        <w:t>journals</w:t>
-      </w:r>
-      <w:r>
-        <w:rPr>
-          <w:rFonts w:cs="Calibri" w:ascii="Calibri" w:hAnsi="Calibri"/>
-        </w:rPr>
-        <w:t xml:space="preserve">. A </w:t>
-      </w:r>
-      <w:r>
-        <w:rPr>
-          <w:b/>
-          <w:rFonts w:cs="Calibri" w:ascii="Calibri" w:hAnsi="Calibri"/>
-        </w:rPr>
-        <w:t>bank</w:t>
-      </w:r>
-      <w:r>
-        <w:rPr>
-          <w:rFonts w:cs="Calibri" w:ascii="Calibri" w:hAnsi="Calibri"/>
-        </w:rPr>
-        <w:t xml:space="preserve"> needs both a bank record and a bank journal; a </w:t>
-      </w:r>
-      <w:r>
-        <w:rPr>
-          <w:b/>
-          <w:rFonts w:cs="Calibri" w:ascii="Calibri" w:hAnsi="Calibri"/>
-        </w:rPr>
-        <w:t>money safe / cash box</w:t>
-      </w:r>
-      <w:r>
-        <w:rPr>
-          <w:rFonts w:cs="Calibri" w:ascii="Calibri" w:hAnsi="Calibri"/>
-        </w:rPr>
-        <w:t xml:space="preserve"> is a </w:t>
-      </w:r>
-      <w:r>
-        <w:rPr>
-          <w:b/>
-          <w:rFonts w:cs="Calibri" w:ascii="Calibri" w:hAnsi="Calibri"/>
-        </w:rPr>
-        <w:t>cash journal</w:t>
-      </w:r>
-      <w:r>
-        <w:rPr>
-          <w:rFonts w:cs="Calibri" w:ascii="Calibri" w:hAnsi="Calibri"/>
-        </w:rPr>
-        <w:t>.</w:t>
+      <w:pPr>
+        <w:jc w:val="center"/>
+      </w:pPr>
+      <w:r>
+        <w:rPr>
+          <w:i/>
+          <w:color w:val="555555"/>
+          <w:sz w:val="19"/>
+          <w:rFonts w:cs="Calibri" w:ascii="Calibri" w:hAnsi="Calibri"/>
+        </w:rPr>
+        <w:t>Figure 4 — The Contacts directory — customers and suppliers share one list.</w:t>
+      </w:r>
+    </w:p>
+    <w:p/>
+    <w:p>
+      <w:pPr>
+        <w:pStyle w:val="Heading2"/>
+      </w:pPr>
+      <w:r>
+        <w:rPr>
+          <w:rFonts w:cs="Calibri" w:ascii="Calibri" w:hAnsi="Calibri"/>
+        </w:rPr>
+        <w:t>3.4 Banks and money safes</w:t>
       </w:r>
     </w:p>
     <w:p>
-      <w:pPr>
-        <w:pStyle w:val="ListNumber"/>
-      </w:pPr>
-      <w:r>
-        <w:rPr>
-          <w:rFonts w:cs="Calibri" w:ascii="Calibri" w:hAnsi="Calibri"/>
-        </w:rPr>
-        <w:t xml:space="preserve">Create the institution: </w:t>
+      <w:r>
+        <w:rPr>
+          <w:rFonts w:cs="Calibri" w:ascii="Calibri" w:hAnsi="Calibri"/>
+        </w:rPr>
+        <w:t xml:space="preserve">Money flows are tracked through </w:t>
       </w:r>
       <w:r>
         <w:rPr>
           <w:b/>
           <w:rFonts w:cs="Calibri" w:ascii="Calibri" w:hAnsi="Calibri"/>
         </w:rPr>
-        <w:t>Accounting → Configuration → Banks → New</w:t>
-      </w:r>
-      <w:r>
-        <w:rPr>
-          <w:rFonts w:cs="Calibri" w:ascii="Calibri" w:hAnsi="Calibri"/>
-        </w:rPr>
-        <w:t xml:space="preserve"> (name, SWIFT/BIC).</w:t>
+        <w:t>journals</w:t>
+      </w:r>
+      <w:r>
+        <w:rPr>
+          <w:rFonts w:cs="Calibri" w:ascii="Calibri" w:hAnsi="Calibri"/>
+        </w:rPr>
+        <w:t xml:space="preserve">. A </w:t>
+      </w:r>
+      <w:r>
+        <w:rPr>
+          <w:b/>
+          <w:rFonts w:cs="Calibri" w:ascii="Calibri" w:hAnsi="Calibri"/>
+        </w:rPr>
+        <w:t>bank</w:t>
+      </w:r>
+      <w:r>
+        <w:rPr>
+          <w:rFonts w:cs="Calibri" w:ascii="Calibri" w:hAnsi="Calibri"/>
+        </w:rPr>
+        <w:t xml:space="preserve"> needs both a bank record and a bank journal; a </w:t>
+      </w:r>
+      <w:r>
+        <w:rPr>
+          <w:b/>
+          <w:rFonts w:cs="Calibri" w:ascii="Calibri" w:hAnsi="Calibri"/>
+        </w:rPr>
+        <w:t>money safe / cash box</w:t>
+      </w:r>
+      <w:r>
+        <w:rPr>
+          <w:rFonts w:cs="Calibri" w:ascii="Calibri" w:hAnsi="Calibri"/>
+        </w:rPr>
+        <w:t xml:space="preserve"> is a </w:t>
+      </w:r>
+      <w:r>
+        <w:rPr>
+          <w:b/>
+          <w:rFonts w:cs="Calibri" w:ascii="Calibri" w:hAnsi="Calibri"/>
+        </w:rPr>
+        <w:t>cash journal</w:t>
+      </w:r>
+      <w:r>
+        <w:rPr>
+          <w:rFonts w:cs="Calibri" w:ascii="Calibri" w:hAnsi="Calibri"/>
+        </w:rPr>
+        <w:t>.</w:t>
       </w:r>
     </w:p>
     <w:p>
@@ -1903,33 +2095,20 @@
         <w:rPr>
           <w:rFonts w:cs="Calibri" w:ascii="Calibri" w:hAnsi="Calibri"/>
         </w:rPr>
-        <w:t xml:space="preserve">Create a </w:t>
+        <w:t xml:space="preserve">Create the institution: </w:t>
       </w:r>
       <w:r>
         <w:rPr>
           <w:b/>
           <w:rFonts w:cs="Calibri" w:ascii="Calibri" w:hAnsi="Calibri"/>
         </w:rPr>
-        <w:t>Bank</w:t>
-      </w:r>
-      <w:r>
-        <w:rPr>
-          <w:rFonts w:cs="Calibri" w:ascii="Calibri" w:hAnsi="Calibri"/>
-        </w:rPr>
-        <w:t xml:space="preserve"> journal: Type = </w:t>
-      </w:r>
-      <w:r>
-        <w:rPr>
-          <w:b/>
-          <w:rFonts w:cs="Calibri" w:ascii="Calibri" w:hAnsi="Calibri"/>
-        </w:rPr>
-        <w:t>Bank</w:t>
-      </w:r>
-      <w:r>
-        <w:rPr>
-          <w:rFonts w:cs="Calibri" w:ascii="Calibri" w:hAnsi="Calibri"/>
-        </w:rPr>
-        <w:t>. Set a currency for a foreign-currency account (e.g. a USD bank account).</w:t>
+        <w:t>Accounting → Configuration → Banks → New</w:t>
+      </w:r>
+      <w:r>
+        <w:rPr>
+          <w:rFonts w:cs="Calibri" w:ascii="Calibri" w:hAnsi="Calibri"/>
+        </w:rPr>
+        <w:t xml:space="preserve"> (name, SWIFT/BIC).</w:t>
       </w:r>
     </w:p>
     <w:p>
@@ -1947,6 +2126,43 @@
           <w:b/>
           <w:rFonts w:cs="Calibri" w:ascii="Calibri" w:hAnsi="Calibri"/>
         </w:rPr>
+        <w:t>Bank</w:t>
+      </w:r>
+      <w:r>
+        <w:rPr>
+          <w:rFonts w:cs="Calibri" w:ascii="Calibri" w:hAnsi="Calibri"/>
+        </w:rPr>
+        <w:t xml:space="preserve"> journal: Type = </w:t>
+      </w:r>
+      <w:r>
+        <w:rPr>
+          <w:b/>
+          <w:rFonts w:cs="Calibri" w:ascii="Calibri" w:hAnsi="Calibri"/>
+        </w:rPr>
+        <w:t>Bank</w:t>
+      </w:r>
+      <w:r>
+        <w:rPr>
+          <w:rFonts w:cs="Calibri" w:ascii="Calibri" w:hAnsi="Calibri"/>
+        </w:rPr>
+        <w:t>. Set a currency for a foreign-currency account (e.g. a USD bank account).</w:t>
+      </w:r>
+    </w:p>
+    <w:p>
+      <w:pPr>
+        <w:pStyle w:val="ListNumber"/>
+      </w:pPr>
+      <w:r>
+        <w:rPr>
+          <w:rFonts w:cs="Calibri" w:ascii="Calibri" w:hAnsi="Calibri"/>
+        </w:rPr>
+        <w:t xml:space="preserve">Create a </w:t>
+      </w:r>
+      <w:r>
+        <w:rPr>
+          <w:b/>
+          <w:rFonts w:cs="Calibri" w:ascii="Calibri" w:hAnsi="Calibri"/>
+        </w:rPr>
         <w:t>Cash</w:t>
       </w:r>
       <w:r>
@@ -1966,7 +2182,33 @@
         <w:rPr>
           <w:rFonts w:cs="Calibri" w:ascii="Calibri" w:hAnsi="Calibri"/>
         </w:rPr>
-        <w:t xml:space="preserve"> (e.g. *Main Cash Safe (SDG)*, *USD Cash Safe*).</w:t>
+        <w:t xml:space="preserve"> (e.g. </w:t>
+      </w:r>
+      <w:r>
+        <w:rPr>
+          <w:i/>
+          <w:rFonts w:cs="Calibri" w:ascii="Calibri" w:hAnsi="Calibri"/>
+        </w:rPr>
+        <w:t>Main Cash Safe (SDG)</w:t>
+      </w:r>
+      <w:r>
+        <w:rPr>
+          <w:rFonts w:cs="Calibri" w:ascii="Calibri" w:hAnsi="Calibri"/>
+        </w:rPr>
+        <w:t xml:space="preserve">, </w:t>
+      </w:r>
+      <w:r>
+        <w:rPr>
+          <w:i/>
+          <w:rFonts w:cs="Calibri" w:ascii="Calibri" w:hAnsi="Calibri"/>
+        </w:rPr>
+        <w:t>USD Cash Safe</w:t>
+      </w:r>
+      <w:r>
+        <w:rPr>
+          <w:rFonts w:cs="Calibri" w:ascii="Calibri" w:hAnsi="Calibri"/>
+        </w:rPr>
+        <w:t>).</w:t>
       </w:r>
     </w:p>
     <w:tbl>
@@ -2047,7 +2289,33 @@
         <w:rPr>
           <w:rFonts w:cs="Calibri" w:ascii="Calibri" w:hAnsi="Calibri"/>
         </w:rPr>
-        <w:t xml:space="preserve"> to buy, stock and sell in different units — for example purchase a *Box of 100* but issue *units*. Define units and conversion factors under </w:t>
+        <w:t xml:space="preserve"> to buy, stock and sell in different units — for example purchase a </w:t>
+      </w:r>
+      <w:r>
+        <w:rPr>
+          <w:i/>
+          <w:rFonts w:cs="Calibri" w:ascii="Calibri" w:hAnsi="Calibri"/>
+        </w:rPr>
+        <w:t>Box of 100</w:t>
+      </w:r>
+      <w:r>
+        <w:rPr>
+          <w:rFonts w:cs="Calibri" w:ascii="Calibri" w:hAnsi="Calibri"/>
+        </w:rPr>
+        <w:t xml:space="preserve"> but issue </w:t>
+      </w:r>
+      <w:r>
+        <w:rPr>
+          <w:i/>
+          <w:rFonts w:cs="Calibri" w:ascii="Calibri" w:hAnsi="Calibri"/>
+        </w:rPr>
+        <w:t>units</w:t>
+      </w:r>
+      <w:r>
+        <w:rPr>
+          <w:rFonts w:cs="Calibri" w:ascii="Calibri" w:hAnsi="Calibri"/>
+        </w:rPr>
+        <w:t xml:space="preserve">. Define units and conversion factors under </w:t>
       </w:r>
       <w:r>
         <w:rPr>
@@ -2095,7 +2363,20 @@
         <w:rPr>
           <w:rFonts w:cs="Calibri" w:ascii="Calibri" w:hAnsi="Calibri"/>
         </w:rPr>
-        <w:t xml:space="preserve"> and create one per physical site (name + short code, e.g. *Khartoum Central / KRT*).</w:t>
+        <w:t xml:space="preserve"> and create one per physical site (name + short code, e.g. </w:t>
+      </w:r>
+      <w:r>
+        <w:rPr>
+          <w:i/>
+          <w:rFonts w:cs="Calibri" w:ascii="Calibri" w:hAnsi="Calibri"/>
+        </w:rPr>
+        <w:t>Khartoum Central / KRT</w:t>
+      </w:r>
+      <w:r>
+        <w:rPr>
+          <w:rFonts w:cs="Calibri" w:ascii="Calibri" w:hAnsi="Calibri"/>
+        </w:rPr>
+        <w:t>).</w:t>
       </w:r>
     </w:p>
     <w:p>
@@ -2233,6 +2514,60 @@
         </w:tc>
       </w:tr>
     </w:tbl>
+    <w:p/>
+    <w:p>
+      <w:pPr>
+        <w:jc w:val="center"/>
+      </w:pPr>
+      <w:r>
+        <w:drawing>
+          <wp:inline xmlns:a="http://schemas.openxmlformats.org/drawingml/2006/main" xmlns:pic="http://schemas.openxmlformats.org/drawingml/2006/picture">
+            <wp:extent cx="5577840" cy="3542682"/>
+            <wp:docPr id="5" name="Picture 5"/>
+            <wp:cNvGraphicFramePr>
+              <a:graphicFrameLocks noChangeAspect="1"/>
+            </wp:cNvGraphicFramePr>
+            <a:graphic>
+              <a:graphicData uri="http://schemas.openxmlformats.org/drawingml/2006/picture">
+                <pic:pic>
+                  <pic:nvPicPr>
+                    <pic:cNvPr id="0" name="locations.png"/>
+                    <pic:cNvPicPr/>
+                  </pic:nvPicPr>
+                  <pic:blipFill>
+                    <a:blip r:embed="rId14"/>
+                    <a:stretch>
+                      <a:fillRect/>
+                    </a:stretch>
+                  </pic:blipFill>
+                  <pic:spPr>
+                    <a:xfrm>
+                      <a:off x="0" y="0"/>
+                      <a:ext cx="5577840" cy="3542682"/>
+                    </a:xfrm>
+                    <a:prstGeom prst="rect"/>
+                  </pic:spPr>
+                </pic:pic>
+              </a:graphicData>
+            </a:graphic>
+          </wp:inline>
+        </w:drawing>
+      </w:r>
+    </w:p>
+    <w:p>
+      <w:pPr>
+        <w:jc w:val="center"/>
+      </w:pPr>
+      <w:r>
+        <w:rPr>
+          <w:i/>
+          <w:color w:val="555555"/>
+          <w:sz w:val="19"/>
+          <w:rFonts w:cs="Calibri" w:ascii="Calibri" w:hAnsi="Calibri"/>
+        </w:rPr>
+        <w:t>Figure 5 — Internal locations under Khartoum Central — including **Cold Storage (2-8°C)**, **Quarantine** and **Expired / Damaged**.</w:t>
+      </w:r>
+    </w:p>
     <w:p/>
     <w:p>
       <w:pPr>
@@ -2730,95 +3065,155 @@
     </w:p>
     <w:p>
       <w:pPr>
-        <w:pStyle w:val="Heading2"/>
-      </w:pPr>
-      <w:r>
-        <w:rPr>
-          <w:rFonts w:cs="Calibri" w:ascii="Calibri" w:hAnsi="Calibri"/>
-        </w:rPr>
-        <w:t>4.2 Lot / batch and expiry tracking</w:t>
+        <w:jc w:val="center"/>
+      </w:pPr>
+      <w:r>
+        <w:drawing>
+          <wp:inline xmlns:a="http://schemas.openxmlformats.org/drawingml/2006/main" xmlns:pic="http://schemas.openxmlformats.org/drawingml/2006/picture">
+            <wp:extent cx="5577840" cy="3542682"/>
+            <wp:docPr id="6" name="Picture 6"/>
+            <wp:cNvGraphicFramePr>
+              <a:graphicFrameLocks noChangeAspect="1"/>
+            </wp:cNvGraphicFramePr>
+            <a:graphic>
+              <a:graphicData uri="http://schemas.openxmlformats.org/drawingml/2006/picture">
+                <pic:pic>
+                  <pic:nvPicPr>
+                    <pic:cNvPr id="0" name="products_list.png"/>
+                    <pic:cNvPicPr/>
+                  </pic:nvPicPr>
+                  <pic:blipFill>
+                    <a:blip r:embed="rId15"/>
+                    <a:stretch>
+                      <a:fillRect/>
+                    </a:stretch>
+                  </pic:blipFill>
+                  <pic:spPr>
+                    <a:xfrm>
+                      <a:off x="0" y="0"/>
+                      <a:ext cx="5577840" cy="3542682"/>
+                    </a:xfrm>
+                    <a:prstGeom prst="rect"/>
+                  </pic:spPr>
+                </pic:pic>
+              </a:graphicData>
+            </a:graphic>
+          </wp:inline>
+        </w:drawing>
       </w:r>
     </w:p>
     <w:p>
-      <w:r>
-        <w:rPr>
-          <w:rFonts w:cs="Calibri" w:ascii="Calibri" w:hAnsi="Calibri"/>
-        </w:rPr>
-        <w:t xml:space="preserve">Lot tracking records which </w:t>
-      </w:r>
-      <w:r>
-        <w:rPr>
-          <w:b/>
-          <w:rFonts w:cs="Calibri" w:ascii="Calibri" w:hAnsi="Calibri"/>
-        </w:rPr>
-        <w:t>batch</w:t>
-      </w:r>
-      <w:r>
-        <w:rPr>
-          <w:rFonts w:cs="Calibri" w:ascii="Calibri" w:hAnsi="Calibri"/>
-        </w:rPr>
-        <w:t xml:space="preserve"> each unit belongs to; expiry tracking records the </w:t>
-      </w:r>
-      <w:r>
-        <w:rPr>
-          <w:b/>
-          <w:rFonts w:cs="Calibri" w:ascii="Calibri" w:hAnsi="Calibri"/>
-        </w:rPr>
-        <w:t>expiration date</w:t>
-      </w:r>
-      <w:r>
-        <w:rPr>
-          <w:rFonts w:cs="Calibri" w:ascii="Calibri" w:hAnsi="Calibri"/>
-        </w:rPr>
-        <w:t xml:space="preserve"> of each batch. Together they give full traceability and drive FEFO.</w:t>
+      <w:pPr>
+        <w:jc w:val="center"/>
+      </w:pPr>
+      <w:r>
+        <w:rPr>
+          <w:i/>
+          <w:color w:val="555555"/>
+          <w:sz w:val="19"/>
+          <w:rFonts w:cs="Calibri" w:ascii="Calibri" w:hAnsi="Calibri"/>
+        </w:rPr>
+        <w:t>Figure 6 — The medical product catalogue with on-hand quantities.</w:t>
+      </w:r>
+    </w:p>
+    <w:p/>
+    <w:p>
+      <w:pPr>
+        <w:jc w:val="center"/>
+      </w:pPr>
+      <w:r>
+        <w:drawing>
+          <wp:inline xmlns:a="http://schemas.openxmlformats.org/drawingml/2006/main" xmlns:pic="http://schemas.openxmlformats.org/drawingml/2006/picture">
+            <wp:extent cx="5577840" cy="3542682"/>
+            <wp:docPr id="7" name="Picture 7"/>
+            <wp:cNvGraphicFramePr>
+              <a:graphicFrameLocks noChangeAspect="1"/>
+            </wp:cNvGraphicFramePr>
+            <a:graphic>
+              <a:graphicData uri="http://schemas.openxmlformats.org/drawingml/2006/picture">
+                <pic:pic>
+                  <pic:nvPicPr>
+                    <pic:cNvPr id="0" name="product_insulin.png"/>
+                    <pic:cNvPicPr/>
+                  </pic:nvPicPr>
+                  <pic:blipFill>
+                    <a:blip r:embed="rId16"/>
+                    <a:stretch>
+                      <a:fillRect/>
+                    </a:stretch>
+                  </pic:blipFill>
+                  <pic:spPr>
+                    <a:xfrm>
+                      <a:off x="0" y="0"/>
+                      <a:ext cx="5577840" cy="3542682"/>
+                    </a:xfrm>
+                    <a:prstGeom prst="rect"/>
+                  </pic:spPr>
+                </pic:pic>
+              </a:graphicData>
+            </a:graphic>
+          </wp:inline>
+        </w:drawing>
       </w:r>
     </w:p>
     <w:p>
       <w:pPr>
-        <w:pStyle w:val="ListBullet"/>
-      </w:pPr>
-      <w:r>
-        <w:rPr>
-          <w:rFonts w:cs="Calibri" w:ascii="Calibri" w:hAnsi="Calibri"/>
-        </w:rPr>
-        <w:t xml:space="preserve">On receipt the system asks for the </w:t>
-      </w:r>
-      <w:r>
-        <w:rPr>
-          <w:b/>
-          <w:rFonts w:cs="Calibri" w:ascii="Calibri" w:hAnsi="Calibri"/>
-        </w:rPr>
-        <w:t>lot number</w:t>
-      </w:r>
-      <w:r>
-        <w:rPr>
-          <w:rFonts w:cs="Calibri" w:ascii="Calibri" w:hAnsi="Calibri"/>
-        </w:rPr>
-        <w:t xml:space="preserve"> and </w:t>
-      </w:r>
-      <w:r>
-        <w:rPr>
-          <w:b/>
-          <w:rFonts w:cs="Calibri" w:ascii="Calibri" w:hAnsi="Calibri"/>
-        </w:rPr>
-        <w:t>expiry date</w:t>
-      </w:r>
-      <w:r>
-        <w:rPr>
-          <w:rFonts w:cs="Calibri" w:ascii="Calibri" w:hAnsi="Calibri"/>
-        </w:rPr>
-        <w:t>.</w:t>
+        <w:jc w:val="center"/>
+      </w:pPr>
+      <w:r>
+        <w:rPr>
+          <w:i/>
+          <w:color w:val="555555"/>
+          <w:sz w:val="19"/>
+          <w:rFonts w:cs="Calibri" w:ascii="Calibri" w:hAnsi="Calibri"/>
+        </w:rPr>
+        <w:t>Figure 7 — Product form for **Insulin Vial 10ml** — tracked by lot, with expiry control and a cost in SDG.</w:t>
+      </w:r>
+    </w:p>
+    <w:p/>
+    <w:p>
+      <w:pPr>
+        <w:pStyle w:val="Heading2"/>
+      </w:pPr>
+      <w:r>
+        <w:rPr>
+          <w:rFonts w:cs="Calibri" w:ascii="Calibri" w:hAnsi="Calibri"/>
+        </w:rPr>
+        <w:t>4.2 Lot / batch and expiry tracking</w:t>
       </w:r>
     </w:p>
     <w:p>
-      <w:pPr>
-        <w:pStyle w:val="ListBullet"/>
-      </w:pPr>
-      <w:r>
-        <w:rPr>
-          <w:rFonts w:cs="Calibri" w:ascii="Calibri" w:hAnsi="Calibri"/>
-        </w:rPr>
-        <w:t>Stock can be traced by lot for recalls and audits.</w:t>
+      <w:r>
+        <w:rPr>
+          <w:rFonts w:cs="Calibri" w:ascii="Calibri" w:hAnsi="Calibri"/>
+        </w:rPr>
+        <w:t xml:space="preserve">Lot tracking records which </w:t>
+      </w:r>
+      <w:r>
+        <w:rPr>
+          <w:b/>
+          <w:rFonts w:cs="Calibri" w:ascii="Calibri" w:hAnsi="Calibri"/>
+        </w:rPr>
+        <w:t>batch</w:t>
+      </w:r>
+      <w:r>
+        <w:rPr>
+          <w:rFonts w:cs="Calibri" w:ascii="Calibri" w:hAnsi="Calibri"/>
+        </w:rPr>
+        <w:t xml:space="preserve"> each unit belongs to; expiry tracking records the </w:t>
+      </w:r>
+      <w:r>
+        <w:rPr>
+          <w:b/>
+          <w:rFonts w:cs="Calibri" w:ascii="Calibri" w:hAnsi="Calibri"/>
+        </w:rPr>
+        <w:t>expiration date</w:t>
+      </w:r>
+      <w:r>
+        <w:rPr>
+          <w:rFonts w:cs="Calibri" w:ascii="Calibri" w:hAnsi="Calibri"/>
+        </w:rPr>
+        <w:t xml:space="preserve"> of each batch. Together they give full traceability and drive FEFO.</w:t>
       </w:r>
     </w:p>
     <w:p>
@@ -2829,175 +3224,248 @@
         <w:rPr>
           <w:rFonts w:cs="Calibri" w:ascii="Calibri" w:hAnsi="Calibri"/>
         </w:rPr>
-        <w:t>Near-expiry stock is highlighted and issued first under FEFO.</w:t>
+        <w:t xml:space="preserve">On receipt the system asks for the </w:t>
+      </w:r>
+      <w:r>
+        <w:rPr>
+          <w:b/>
+          <w:rFonts w:cs="Calibri" w:ascii="Calibri" w:hAnsi="Calibri"/>
+        </w:rPr>
+        <w:t>lot number</w:t>
+      </w:r>
+      <w:r>
+        <w:rPr>
+          <w:rFonts w:cs="Calibri" w:ascii="Calibri" w:hAnsi="Calibri"/>
+        </w:rPr>
+        <w:t xml:space="preserve"> and </w:t>
+      </w:r>
+      <w:r>
+        <w:rPr>
+          <w:b/>
+          <w:rFonts w:cs="Calibri" w:ascii="Calibri" w:hAnsi="Calibri"/>
+        </w:rPr>
+        <w:t>expiry date</w:t>
+      </w:r>
+      <w:r>
+        <w:rPr>
+          <w:rFonts w:cs="Calibri" w:ascii="Calibri" w:hAnsi="Calibri"/>
+        </w:rPr>
+        <w:t>.</w:t>
       </w:r>
     </w:p>
     <w:p>
       <w:pPr>
-        <w:pStyle w:val="Heading2"/>
-      </w:pPr>
-      <w:r>
-        <w:rPr>
-          <w:rFonts w:cs="Calibri" w:ascii="Calibri" w:hAnsi="Calibri"/>
-        </w:rPr>
-        <w:t>4.3 Checking stock on hand</w:t>
+        <w:pStyle w:val="ListBullet"/>
+      </w:pPr>
+      <w:r>
+        <w:rPr>
+          <w:rFonts w:cs="Calibri" w:ascii="Calibri" w:hAnsi="Calibri"/>
+        </w:rPr>
+        <w:t>Stock can be traced by lot for recalls and audits.</w:t>
       </w:r>
     </w:p>
     <w:p>
-      <w:r>
-        <w:rPr>
-          <w:rFonts w:cs="Calibri" w:ascii="Calibri" w:hAnsi="Calibri"/>
-        </w:rPr>
-        <w:t xml:space="preserve">Open a product and use the </w:t>
-      </w:r>
-      <w:r>
-        <w:rPr>
-          <w:b/>
-          <w:rFonts w:cs="Calibri" w:ascii="Calibri" w:hAnsi="Calibri"/>
-        </w:rPr>
-        <w:t>On Hand</w:t>
-      </w:r>
-      <w:r>
-        <w:rPr>
-          <w:rFonts w:cs="Calibri" w:ascii="Calibri" w:hAnsi="Calibri"/>
-        </w:rPr>
-        <w:t xml:space="preserve"> / </w:t>
-      </w:r>
-      <w:r>
-        <w:rPr>
-          <w:b/>
-          <w:rFonts w:cs="Calibri" w:ascii="Calibri" w:hAnsi="Calibri"/>
-        </w:rPr>
-        <w:t>Forecasted</w:t>
-      </w:r>
-      <w:r>
-        <w:rPr>
-          <w:rFonts w:cs="Calibri" w:ascii="Calibri" w:hAnsi="Calibri"/>
-        </w:rPr>
-        <w:t xml:space="preserve"> smart buttons, or review the on-hand column in the product list. </w:t>
-      </w:r>
-      <w:r>
-        <w:rPr>
-          <w:b/>
-          <w:rFonts w:cs="Calibri" w:ascii="Calibri" w:hAnsi="Calibri"/>
-        </w:rPr>
-        <w:t>Inventory → Reporting</w:t>
-      </w:r>
-      <w:r>
-        <w:rPr>
-          <w:rFonts w:cs="Calibri" w:ascii="Calibri" w:hAnsi="Calibri"/>
-        </w:rPr>
-        <w:t xml:space="preserve"> provides valuation and movement analysis.</w:t>
+      <w:pPr>
+        <w:pStyle w:val="ListBullet"/>
+      </w:pPr>
+      <w:r>
+        <w:rPr>
+          <w:rFonts w:cs="Calibri" w:ascii="Calibri" w:hAnsi="Calibri"/>
+        </w:rPr>
+        <w:t>Near-expiry stock is highlighted and issued first under FEFO.</w:t>
       </w:r>
     </w:p>
     <w:p>
-      <w:r>
-        <w:br w:type="page"/>
+      <w:pPr>
+        <w:jc w:val="center"/>
+      </w:pPr>
+      <w:r>
+        <w:drawing>
+          <wp:inline xmlns:a="http://schemas.openxmlformats.org/drawingml/2006/main" xmlns:pic="http://schemas.openxmlformats.org/drawingml/2006/picture">
+            <wp:extent cx="5577840" cy="3542682"/>
+            <wp:docPr id="8" name="Picture 8"/>
+            <wp:cNvGraphicFramePr>
+              <a:graphicFrameLocks noChangeAspect="1"/>
+            </wp:cNvGraphicFramePr>
+            <a:graphic>
+              <a:graphicData uri="http://schemas.openxmlformats.org/drawingml/2006/picture">
+                <pic:pic>
+                  <pic:nvPicPr>
+                    <pic:cNvPr id="0" name="lots_expiry.png"/>
+                    <pic:cNvPicPr/>
+                  </pic:nvPicPr>
+                  <pic:blipFill>
+                    <a:blip r:embed="rId17"/>
+                    <a:stretch>
+                      <a:fillRect/>
+                    </a:stretch>
+                  </pic:blipFill>
+                  <pic:spPr>
+                    <a:xfrm>
+                      <a:off x="0" y="0"/>
+                      <a:ext cx="5577840" cy="3542682"/>
+                    </a:xfrm>
+                    <a:prstGeom prst="rect"/>
+                  </pic:spPr>
+                </pic:pic>
+              </a:graphicData>
+            </a:graphic>
+          </wp:inline>
+        </w:drawing>
       </w:r>
     </w:p>
     <w:p>
       <w:pPr>
-        <w:pStyle w:val="Heading1"/>
-      </w:pPr>
-      <w:r>
-        <w:rPr>
-          <w:rFonts w:cs="Calibri" w:ascii="Calibri" w:hAnsi="Calibri"/>
-        </w:rPr>
-        <w:t>5. Warehouse Operations</w:t>
+        <w:jc w:val="center"/>
+      </w:pPr>
+      <w:r>
+        <w:rPr>
+          <w:i/>
+          <w:color w:val="555555"/>
+          <w:sz w:val="19"/>
+          <w:rFonts w:cs="Calibri" w:ascii="Calibri" w:hAnsi="Calibri"/>
+        </w:rPr>
+        <w:t>Figure 8 — Lot / batch records, each carrying an expiration date that drives FEFO.</w:t>
+      </w:r>
+    </w:p>
+    <w:p/>
+    <w:p>
+      <w:pPr>
+        <w:pStyle w:val="Heading2"/>
+      </w:pPr>
+      <w:r>
+        <w:rPr>
+          <w:rFonts w:cs="Calibri" w:ascii="Calibri" w:hAnsi="Calibri"/>
+        </w:rPr>
+        <w:t>4.3 Checking stock on hand</w:t>
       </w:r>
     </w:p>
     <w:p>
-      <w:pPr>
-        <w:pStyle w:val="Heading2"/>
-      </w:pPr>
-      <w:r>
-        <w:rPr>
-          <w:rFonts w:cs="Calibri" w:ascii="Calibri" w:hAnsi="Calibri"/>
-        </w:rPr>
-        <w:t>5.1 Receipts (goods in)</w:t>
+      <w:r>
+        <w:rPr>
+          <w:rFonts w:cs="Calibri" w:ascii="Calibri" w:hAnsi="Calibri"/>
+        </w:rPr>
+        <w:t xml:space="preserve">Open a product and use the </w:t>
+      </w:r>
+      <w:r>
+        <w:rPr>
+          <w:b/>
+          <w:rFonts w:cs="Calibri" w:ascii="Calibri" w:hAnsi="Calibri"/>
+        </w:rPr>
+        <w:t>On Hand</w:t>
+      </w:r>
+      <w:r>
+        <w:rPr>
+          <w:rFonts w:cs="Calibri" w:ascii="Calibri" w:hAnsi="Calibri"/>
+        </w:rPr>
+        <w:t xml:space="preserve"> / </w:t>
+      </w:r>
+      <w:r>
+        <w:rPr>
+          <w:b/>
+          <w:rFonts w:cs="Calibri" w:ascii="Calibri" w:hAnsi="Calibri"/>
+        </w:rPr>
+        <w:t>Forecasted</w:t>
+      </w:r>
+      <w:r>
+        <w:rPr>
+          <w:rFonts w:cs="Calibri" w:ascii="Calibri" w:hAnsi="Calibri"/>
+        </w:rPr>
+        <w:t xml:space="preserve"> smart buttons, or review the on-hand column in the product list. </w:t>
+      </w:r>
+      <w:r>
+        <w:rPr>
+          <w:b/>
+          <w:rFonts w:cs="Calibri" w:ascii="Calibri" w:hAnsi="Calibri"/>
+        </w:rPr>
+        <w:t>Inventory → Reporting</w:t>
+      </w:r>
+      <w:r>
+        <w:rPr>
+          <w:rFonts w:cs="Calibri" w:ascii="Calibri" w:hAnsi="Calibri"/>
+        </w:rPr>
+        <w:t xml:space="preserve"> provides valuation and movement analysis.</w:t>
       </w:r>
     </w:p>
     <w:p>
-      <w:pPr>
-        <w:pStyle w:val="ListNumber"/>
-      </w:pPr>
-      <w:r>
-        <w:rPr>
-          <w:rFonts w:cs="Calibri" w:ascii="Calibri" w:hAnsi="Calibri"/>
-        </w:rPr>
-        <w:t>Receipts are generated from confirmed purchase orders.</w:t>
+      <w:r>
+        <w:br w:type="page"/>
       </w:r>
     </w:p>
     <w:p>
       <w:pPr>
-        <w:pStyle w:val="ListNumber"/>
-      </w:pPr>
-      <w:r>
-        <w:rPr>
-          <w:rFonts w:cs="Calibri" w:ascii="Calibri" w:hAnsi="Calibri"/>
-        </w:rPr>
-        <w:t xml:space="preserve">Open the receipt, enter the </w:t>
-      </w:r>
-      <w:r>
-        <w:rPr>
-          <w:b/>
-          <w:rFonts w:cs="Calibri" w:ascii="Calibri" w:hAnsi="Calibri"/>
-        </w:rPr>
-        <w:t>lot number</w:t>
-      </w:r>
-      <w:r>
-        <w:rPr>
-          <w:rFonts w:cs="Calibri" w:ascii="Calibri" w:hAnsi="Calibri"/>
-        </w:rPr>
-        <w:t xml:space="preserve"> and </w:t>
-      </w:r>
-      <w:r>
-        <w:rPr>
-          <w:b/>
-          <w:rFonts w:cs="Calibri" w:ascii="Calibri" w:hAnsi="Calibri"/>
-        </w:rPr>
-        <w:t>expiry date</w:t>
-      </w:r>
-      <w:r>
-        <w:rPr>
-          <w:rFonts w:cs="Calibri" w:ascii="Calibri" w:hAnsi="Calibri"/>
-        </w:rPr>
-        <w:t xml:space="preserve"> for each line, then </w:t>
-      </w:r>
-      <w:r>
-        <w:rPr>
-          <w:b/>
-          <w:rFonts w:cs="Calibri" w:ascii="Calibri" w:hAnsi="Calibri"/>
-        </w:rPr>
-        <w:t>Validate</w:t>
-      </w:r>
-      <w:r>
-        <w:rPr>
-          <w:rFonts w:cs="Calibri" w:ascii="Calibri" w:hAnsi="Calibri"/>
-        </w:rPr>
-        <w:t>.</w:t>
+        <w:pStyle w:val="Heading1"/>
+      </w:pPr>
+      <w:r>
+        <w:rPr>
+          <w:rFonts w:cs="Calibri" w:ascii="Calibri" w:hAnsi="Calibri"/>
+        </w:rPr>
+        <w:t>5. Warehouse Operations</w:t>
       </w:r>
     </w:p>
     <w:p>
       <w:pPr>
-        <w:pStyle w:val="ListNumber"/>
-      </w:pPr>
-      <w:r>
-        <w:rPr>
-          <w:rFonts w:cs="Calibri" w:ascii="Calibri" w:hAnsi="Calibri"/>
-        </w:rPr>
-        <w:t>Stock is added to the destination; putaway rules may route it (e.g. to Cold Storage).</w:t>
+        <w:jc w:val="center"/>
+      </w:pPr>
+      <w:r>
+        <w:drawing>
+          <wp:inline xmlns:a="http://schemas.openxmlformats.org/drawingml/2006/main" xmlns:pic="http://schemas.openxmlformats.org/drawingml/2006/picture">
+            <wp:extent cx="5577840" cy="3542682"/>
+            <wp:docPr id="9" name="Picture 9"/>
+            <wp:cNvGraphicFramePr>
+              <a:graphicFrameLocks noChangeAspect="1"/>
+            </wp:cNvGraphicFramePr>
+            <a:graphic>
+              <a:graphicData uri="http://schemas.openxmlformats.org/drawingml/2006/picture">
+                <pic:pic>
+                  <pic:nvPicPr>
+                    <pic:cNvPr id="0" name="inventory.png"/>
+                    <pic:cNvPicPr/>
+                  </pic:nvPicPr>
+                  <pic:blipFill>
+                    <a:blip r:embed="rId18"/>
+                    <a:stretch>
+                      <a:fillRect/>
+                    </a:stretch>
+                  </pic:blipFill>
+                  <pic:spPr>
+                    <a:xfrm>
+                      <a:off x="0" y="0"/>
+                      <a:ext cx="5577840" cy="3542682"/>
+                    </a:xfrm>
+                    <a:prstGeom prst="rect"/>
+                  </pic:spPr>
+                </pic:pic>
+              </a:graphicData>
+            </a:graphic>
+          </wp:inline>
+        </w:drawing>
       </w:r>
     </w:p>
     <w:p>
       <w:pPr>
+        <w:jc w:val="center"/>
+      </w:pPr>
+      <w:r>
+        <w:rPr>
+          <w:i/>
+          <w:color w:val="555555"/>
+          <w:sz w:val="19"/>
+          <w:rFonts w:cs="Calibri" w:ascii="Calibri" w:hAnsi="Calibri"/>
+        </w:rPr>
+        <w:t>Figure 9 — The Inventory overview — each card is an operation type (receipts, deliveries, internal transfers) with its count of work to process.</w:t>
+      </w:r>
+    </w:p>
+    <w:p/>
+    <w:p>
+      <w:pPr>
         <w:pStyle w:val="Heading2"/>
       </w:pPr>
       <w:r>
         <w:rPr>
           <w:rFonts w:cs="Calibri" w:ascii="Calibri" w:hAnsi="Calibri"/>
         </w:rPr>
-        <w:t>5.2 Deliveries (goods out)</w:t>
+        <w:t>5.1 Receipts (goods in)</w:t>
       </w:r>
     </w:p>
     <w:p>
@@ -3008,7 +3476,7 @@
         <w:rPr>
           <w:rFonts w:cs="Calibri" w:ascii="Calibri" w:hAnsi="Calibri"/>
         </w:rPr>
-        <w:t>Deliveries are generated from confirmed sales orders.</w:t>
+        <w:t>Receipts are generated from confirmed purchase orders.</w:t>
       </w:r>
     </w:p>
     <w:p>
@@ -3019,20 +3487,46 @@
         <w:rPr>
           <w:rFonts w:cs="Calibri" w:ascii="Calibri" w:hAnsi="Calibri"/>
         </w:rPr>
-        <w:t xml:space="preserve">The system reserves stock — under </w:t>
+        <w:t xml:space="preserve">Open the receipt, enter the </w:t>
       </w:r>
       <w:r>
         <w:rPr>
           <w:b/>
           <w:rFonts w:cs="Calibri" w:ascii="Calibri" w:hAnsi="Calibri"/>
         </w:rPr>
-        <w:t>FEFO</w:t>
-      </w:r>
-      <w:r>
-        <w:rPr>
-          <w:rFonts w:cs="Calibri" w:ascii="Calibri" w:hAnsi="Calibri"/>
-        </w:rPr>
-        <w:t xml:space="preserve"> it selects the soonest-to-expire lots.</w:t>
+        <w:t>lot number</w:t>
+      </w:r>
+      <w:r>
+        <w:rPr>
+          <w:rFonts w:cs="Calibri" w:ascii="Calibri" w:hAnsi="Calibri"/>
+        </w:rPr>
+        <w:t xml:space="preserve"> and </w:t>
+      </w:r>
+      <w:r>
+        <w:rPr>
+          <w:b/>
+          <w:rFonts w:cs="Calibri" w:ascii="Calibri" w:hAnsi="Calibri"/>
+        </w:rPr>
+        <w:t>expiry date</w:t>
+      </w:r>
+      <w:r>
+        <w:rPr>
+          <w:rFonts w:cs="Calibri" w:ascii="Calibri" w:hAnsi="Calibri"/>
+        </w:rPr>
+        <w:t xml:space="preserve"> for each line, then </w:t>
+      </w:r>
+      <w:r>
+        <w:rPr>
+          <w:b/>
+          <w:rFonts w:cs="Calibri" w:ascii="Calibri" w:hAnsi="Calibri"/>
+        </w:rPr>
+        <w:t>Validate</w:t>
+      </w:r>
+      <w:r>
+        <w:rPr>
+          <w:rFonts w:cs="Calibri" w:ascii="Calibri" w:hAnsi="Calibri"/>
+        </w:rPr>
+        <w:t>.</w:t>
       </w:r>
     </w:p>
     <w:p>
@@ -3041,16 +3535,9 @@
       </w:pPr>
       <w:r>
         <w:rPr>
-          <w:b/>
-          <w:rFonts w:cs="Calibri" w:ascii="Calibri" w:hAnsi="Calibri"/>
-        </w:rPr>
-        <w:t>Validate</w:t>
-      </w:r>
-      <w:r>
-        <w:rPr>
-          <w:rFonts w:cs="Calibri" w:ascii="Calibri" w:hAnsi="Calibri"/>
-        </w:rPr>
-        <w:t xml:space="preserve"> the delivery to ship the goods and reduce stock.</w:t>
+          <w:rFonts w:cs="Calibri" w:ascii="Calibri" w:hAnsi="Calibri"/>
+        </w:rPr>
+        <w:t>Stock is added to the destination; putaway rules may route it (e.g. to Cold Storage).</w:t>
       </w:r>
     </w:p>
     <w:p>
@@ -3061,10 +3548,74 @@
         <w:rPr>
           <w:rFonts w:cs="Calibri" w:ascii="Calibri" w:hAnsi="Calibri"/>
         </w:rPr>
-        <w:t>5.3 Internal transfers</w:t>
+        <w:t>5.2 Deliveries (goods out)</w:t>
       </w:r>
     </w:p>
     <w:p>
+      <w:pPr>
+        <w:pStyle w:val="ListNumber"/>
+      </w:pPr>
+      <w:r>
+        <w:rPr>
+          <w:rFonts w:cs="Calibri" w:ascii="Calibri" w:hAnsi="Calibri"/>
+        </w:rPr>
+        <w:t>Deliveries are generated from confirmed sales orders.</w:t>
+      </w:r>
+    </w:p>
+    <w:p>
+      <w:pPr>
+        <w:pStyle w:val="ListNumber"/>
+      </w:pPr>
+      <w:r>
+        <w:rPr>
+          <w:rFonts w:cs="Calibri" w:ascii="Calibri" w:hAnsi="Calibri"/>
+        </w:rPr>
+        <w:t xml:space="preserve">The system reserves stock — under </w:t>
+      </w:r>
+      <w:r>
+        <w:rPr>
+          <w:b/>
+          <w:rFonts w:cs="Calibri" w:ascii="Calibri" w:hAnsi="Calibri"/>
+        </w:rPr>
+        <w:t>FEFO</w:t>
+      </w:r>
+      <w:r>
+        <w:rPr>
+          <w:rFonts w:cs="Calibri" w:ascii="Calibri" w:hAnsi="Calibri"/>
+        </w:rPr>
+        <w:t xml:space="preserve"> it selects the soonest-to-expire lots.</w:t>
+      </w:r>
+    </w:p>
+    <w:p>
+      <w:pPr>
+        <w:pStyle w:val="ListNumber"/>
+      </w:pPr>
+      <w:r>
+        <w:rPr>
+          <w:b/>
+          <w:rFonts w:cs="Calibri" w:ascii="Calibri" w:hAnsi="Calibri"/>
+        </w:rPr>
+        <w:t>Validate</w:t>
+      </w:r>
+      <w:r>
+        <w:rPr>
+          <w:rFonts w:cs="Calibri" w:ascii="Calibri" w:hAnsi="Calibri"/>
+        </w:rPr>
+        <w:t xml:space="preserve"> the delivery to ship the goods and reduce stock.</w:t>
+      </w:r>
+    </w:p>
+    <w:p>
+      <w:pPr>
+        <w:pStyle w:val="Heading2"/>
+      </w:pPr>
+      <w:r>
+        <w:rPr>
+          <w:rFonts w:cs="Calibri" w:ascii="Calibri" w:hAnsi="Calibri"/>
+        </w:rPr>
+        <w:t>5.3 Internal transfers</w:t>
+      </w:r>
+    </w:p>
+    <w:p>
       <w:r>
         <w:rPr>
           <w:rFonts w:cs="Calibri" w:ascii="Calibri" w:hAnsi="Calibri"/>
@@ -3098,6 +3649,60 @@
         <w:t>, choose the source and destination, add the product and lot, and validate.</w:t>
       </w:r>
     </w:p>
+    <w:p>
+      <w:pPr>
+        <w:jc w:val="center"/>
+      </w:pPr>
+      <w:r>
+        <w:drawing>
+          <wp:inline xmlns:a="http://schemas.openxmlformats.org/drawingml/2006/main" xmlns:pic="http://schemas.openxmlformats.org/drawingml/2006/picture">
+            <wp:extent cx="5577840" cy="3542682"/>
+            <wp:docPr id="10" name="Picture 10"/>
+            <wp:cNvGraphicFramePr>
+              <a:graphicFrameLocks noChangeAspect="1"/>
+            </wp:cNvGraphicFramePr>
+            <a:graphic>
+              <a:graphicData uri="http://schemas.openxmlformats.org/drawingml/2006/picture">
+                <pic:pic>
+                  <pic:nvPicPr>
+                    <pic:cNvPr id="0" name="transfers.png"/>
+                    <pic:cNvPicPr/>
+                  </pic:nvPicPr>
+                  <pic:blipFill>
+                    <a:blip r:embed="rId19"/>
+                    <a:stretch>
+                      <a:fillRect/>
+                    </a:stretch>
+                  </pic:blipFill>
+                  <pic:spPr>
+                    <a:xfrm>
+                      <a:off x="0" y="0"/>
+                      <a:ext cx="5577840" cy="3542682"/>
+                    </a:xfrm>
+                    <a:prstGeom prst="rect"/>
+                  </pic:spPr>
+                </pic:pic>
+              </a:graphicData>
+            </a:graphic>
+          </wp:inline>
+        </w:drawing>
+      </w:r>
+    </w:p>
+    <w:p>
+      <w:pPr>
+        <w:jc w:val="center"/>
+      </w:pPr>
+      <w:r>
+        <w:rPr>
+          <w:i/>
+          <w:color w:val="555555"/>
+          <w:sz w:val="19"/>
+          <w:rFonts w:cs="Calibri" w:ascii="Calibri" w:hAnsi="Calibri"/>
+        </w:rPr>
+        <w:t>Figure 10 — The Transfers list — receipts, deliveries and internal moves, each with its status (Done, Ready, Waiting).</w:t>
+      </w:r>
+    </w:p>
+    <w:p/>
     <w:p>
       <w:pPr>
         <w:pStyle w:val="Heading2"/>
@@ -3347,6 +3952,338 @@
     </w:tbl>
     <w:p/>
     <w:p>
+      <w:pPr>
+        <w:pStyle w:val="Heading2"/>
+      </w:pPr>
+      <w:r>
+        <w:rPr>
+          <w:rFonts w:cs="Calibri" w:ascii="Calibri" w:hAnsi="Calibri"/>
+        </w:rPr>
+        <w:t>6.4 Worked example — importing insulin in USD</w:t>
+      </w:r>
+    </w:p>
+    <w:p>
+      <w:r>
+        <w:rPr>
+          <w:rFonts w:cs="Calibri" w:ascii="Calibri" w:hAnsi="Calibri"/>
+        </w:rPr>
+        <w:t xml:space="preserve">This walkthrough uses the demo purchase order </w:t>
+      </w:r>
+      <w:r>
+        <w:rPr>
+          <w:b/>
+          <w:rFonts w:cs="Calibri" w:ascii="Calibri" w:hAnsi="Calibri"/>
+        </w:rPr>
+        <w:t>P00002</w:t>
+      </w:r>
+      <w:r>
+        <w:rPr>
+          <w:rFonts w:cs="Calibri" w:ascii="Calibri" w:hAnsi="Calibri"/>
+        </w:rPr>
+        <w:t xml:space="preserve"> placed with the import supplier </w:t>
+      </w:r>
+      <w:r>
+        <w:rPr>
+          <w:b/>
+          <w:rFonts w:cs="Calibri" w:ascii="Calibri" w:hAnsi="Calibri"/>
+        </w:rPr>
+        <w:t>Gulf MedTrade FZE</w:t>
+      </w:r>
+      <w:r>
+        <w:rPr>
+          <w:rFonts w:cs="Calibri" w:ascii="Calibri" w:hAnsi="Calibri"/>
+        </w:rPr>
+        <w:t xml:space="preserve">, priced in </w:t>
+      </w:r>
+      <w:r>
+        <w:rPr>
+          <w:b/>
+          <w:rFonts w:cs="Calibri" w:ascii="Calibri" w:hAnsi="Calibri"/>
+        </w:rPr>
+        <w:t>USD</w:t>
+      </w:r>
+      <w:r>
+        <w:rPr>
+          <w:rFonts w:cs="Calibri" w:ascii="Calibri" w:hAnsi="Calibri"/>
+        </w:rPr>
+        <w:t>.</w:t>
+      </w:r>
+    </w:p>
+    <w:p>
+      <w:pPr>
+        <w:pStyle w:val="ListNumber"/>
+      </w:pPr>
+      <w:r>
+        <w:rPr>
+          <w:rFonts w:cs="Calibri" w:ascii="Calibri" w:hAnsi="Calibri"/>
+        </w:rPr>
+        <w:t xml:space="preserve">In </w:t>
+      </w:r>
+      <w:r>
+        <w:rPr>
+          <w:b/>
+          <w:rFonts w:cs="Calibri" w:ascii="Calibri" w:hAnsi="Calibri"/>
+        </w:rPr>
+        <w:t>Purchase → Orders</w:t>
+      </w:r>
+      <w:r>
+        <w:rPr>
+          <w:rFonts w:cs="Calibri" w:ascii="Calibri" w:hAnsi="Calibri"/>
+        </w:rPr>
+        <w:t xml:space="preserve">, the order </w:t>
+      </w:r>
+      <w:r>
+        <w:rPr>
+          <w:b/>
+          <w:rFonts w:cs="Calibri" w:ascii="Calibri" w:hAnsi="Calibri"/>
+        </w:rPr>
+        <w:t>P00002</w:t>
+      </w:r>
+      <w:r>
+        <w:rPr>
+          <w:rFonts w:cs="Calibri" w:ascii="Calibri" w:hAnsi="Calibri"/>
+        </w:rPr>
+        <w:t xml:space="preserve"> lists </w:t>
+      </w:r>
+      <w:r>
+        <w:rPr>
+          <w:b/>
+          <w:rFonts w:cs="Calibri" w:ascii="Calibri" w:hAnsi="Calibri"/>
+        </w:rPr>
+        <w:t>50 × Insulin Vial 10ml</w:t>
+      </w:r>
+      <w:r>
+        <w:rPr>
+          <w:rFonts w:cs="Calibri" w:ascii="Calibri" w:hAnsi="Calibri"/>
+        </w:rPr>
+        <w:t xml:space="preserve"> at </w:t>
+      </w:r>
+      <w:r>
+        <w:rPr>
+          <w:b/>
+          <w:rFonts w:cs="Calibri" w:ascii="Calibri" w:hAnsi="Calibri"/>
+        </w:rPr>
+        <w:t>$14.00</w:t>
+      </w:r>
+      <w:r>
+        <w:rPr>
+          <w:rFonts w:cs="Calibri" w:ascii="Calibri" w:hAnsi="Calibri"/>
+        </w:rPr>
+        <w:t xml:space="preserve"> and </w:t>
+      </w:r>
+      <w:r>
+        <w:rPr>
+          <w:b/>
+          <w:rFonts w:cs="Calibri" w:ascii="Calibri" w:hAnsi="Calibri"/>
+        </w:rPr>
+        <w:t>10 × Digital Blood Pressure Monitor</w:t>
+      </w:r>
+      <w:r>
+        <w:rPr>
+          <w:rFonts w:cs="Calibri" w:ascii="Calibri" w:hAnsi="Calibri"/>
+        </w:rPr>
+        <w:t xml:space="preserve"> at </w:t>
+      </w:r>
+      <w:r>
+        <w:rPr>
+          <w:b/>
+          <w:rFonts w:cs="Calibri" w:ascii="Calibri" w:hAnsi="Calibri"/>
+        </w:rPr>
+        <w:t>$42.00</w:t>
+      </w:r>
+      <w:r>
+        <w:rPr>
+          <w:rFonts w:cs="Calibri" w:ascii="Calibri" w:hAnsi="Calibri"/>
+        </w:rPr>
+        <w:t>.</w:t>
+      </w:r>
+    </w:p>
+    <w:p>
+      <w:pPr>
+        <w:pStyle w:val="ListNumber"/>
+      </w:pPr>
+      <w:r>
+        <w:rPr>
+          <w:rFonts w:cs="Calibri" w:ascii="Calibri" w:hAnsi="Calibri"/>
+        </w:rPr>
+        <w:t xml:space="preserve">Because Gulf MedTrade's purchase currency is </w:t>
+      </w:r>
+      <w:r>
+        <w:rPr>
+          <w:b/>
+          <w:rFonts w:cs="Calibri" w:ascii="Calibri" w:hAnsi="Calibri"/>
+        </w:rPr>
+        <w:t>USD</w:t>
+      </w:r>
+      <w:r>
+        <w:rPr>
+          <w:rFonts w:cs="Calibri" w:ascii="Calibri" w:hAnsi="Calibri"/>
+        </w:rPr>
+        <w:t xml:space="preserve">, the order total is </w:t>
+      </w:r>
+      <w:r>
+        <w:rPr>
+          <w:b/>
+          <w:rFonts w:cs="Calibri" w:ascii="Calibri" w:hAnsi="Calibri"/>
+        </w:rPr>
+        <w:t>$1,288.00</w:t>
+      </w:r>
+      <w:r>
+        <w:rPr>
+          <w:rFonts w:cs="Calibri" w:ascii="Calibri" w:hAnsi="Calibri"/>
+        </w:rPr>
+        <w:t xml:space="preserve">; the system shows the SDG value beneath it using the rate on the order date (1 USD = 700 SDG → about </w:t>
+      </w:r>
+      <w:r>
+        <w:rPr>
+          <w:b/>
+          <w:rFonts w:cs="Calibri" w:ascii="Calibri" w:hAnsi="Calibri"/>
+        </w:rPr>
+        <w:t>901,600 SDG</w:t>
+      </w:r>
+      <w:r>
+        <w:rPr>
+          <w:rFonts w:cs="Calibri" w:ascii="Calibri" w:hAnsi="Calibri"/>
+        </w:rPr>
+        <w:t>).</w:t>
+      </w:r>
+    </w:p>
+    <w:p>
+      <w:pPr>
+        <w:pStyle w:val="ListNumber"/>
+      </w:pPr>
+      <w:r>
+        <w:rPr>
+          <w:rFonts w:cs="Calibri" w:ascii="Calibri" w:hAnsi="Calibri"/>
+        </w:rPr>
+        <w:t xml:space="preserve">On </w:t>
+      </w:r>
+      <w:r>
+        <w:rPr>
+          <w:b/>
+          <w:rFonts w:cs="Calibri" w:ascii="Calibri" w:hAnsi="Calibri"/>
+        </w:rPr>
+        <w:t>Confirm Order</w:t>
+      </w:r>
+      <w:r>
+        <w:rPr>
+          <w:rFonts w:cs="Calibri" w:ascii="Calibri" w:hAnsi="Calibri"/>
+        </w:rPr>
+        <w:t xml:space="preserve"> a </w:t>
+      </w:r>
+      <w:r>
+        <w:rPr>
+          <w:b/>
+          <w:rFonts w:cs="Calibri" w:ascii="Calibri" w:hAnsi="Calibri"/>
+        </w:rPr>
+        <w:t>Receipt</w:t>
+      </w:r>
+      <w:r>
+        <w:rPr>
+          <w:rFonts w:cs="Calibri" w:ascii="Calibri" w:hAnsi="Calibri"/>
+        </w:rPr>
+        <w:t xml:space="preserve"> is created. Validating it (with lot </w:t>
+      </w:r>
+      <w:r>
+        <w:rPr>
+          <w:b/>
+          <w:rFonts w:cs="Calibri" w:ascii="Calibri" w:hAnsi="Calibri"/>
+        </w:rPr>
+        <w:t>LOT-GULF-01</w:t>
+      </w:r>
+      <w:r>
+        <w:rPr>
+          <w:rFonts w:cs="Calibri" w:ascii="Calibri" w:hAnsi="Calibri"/>
+        </w:rPr>
+        <w:t xml:space="preserve"> and the expiry date) adds the insulin to stock; the putaway rule routes it to </w:t>
+      </w:r>
+      <w:r>
+        <w:rPr>
+          <w:b/>
+          <w:rFonts w:cs="Calibri" w:ascii="Calibri" w:hAnsi="Calibri"/>
+        </w:rPr>
+        <w:t>Cold Storage</w:t>
+      </w:r>
+      <w:r>
+        <w:rPr>
+          <w:rFonts w:cs="Calibri" w:ascii="Calibri" w:hAnsi="Calibri"/>
+        </w:rPr>
+        <w:t>.</w:t>
+      </w:r>
+    </w:p>
+    <w:p>
+      <w:pPr>
+        <w:pStyle w:val="ListNumber"/>
+      </w:pPr>
+      <w:r>
+        <w:rPr>
+          <w:b/>
+          <w:rFonts w:cs="Calibri" w:ascii="Calibri" w:hAnsi="Calibri"/>
+        </w:rPr>
+        <w:t>Create Bill</w:t>
+      </w:r>
+      <w:r>
+        <w:rPr>
+          <w:rFonts w:cs="Calibri" w:ascii="Calibri" w:hAnsi="Calibri"/>
+        </w:rPr>
+        <w:t xml:space="preserve"> generates the vendor bill in USD; it is valued in SDG when posted.</w:t>
+      </w:r>
+    </w:p>
+    <w:p>
+      <w:pPr>
+        <w:jc w:val="center"/>
+      </w:pPr>
+      <w:r>
+        <w:drawing>
+          <wp:inline xmlns:a="http://schemas.openxmlformats.org/drawingml/2006/main" xmlns:pic="http://schemas.openxmlformats.org/drawingml/2006/picture">
+            <wp:extent cx="5577840" cy="3542682"/>
+            <wp:docPr id="11" name="Picture 11"/>
+            <wp:cNvGraphicFramePr>
+              <a:graphicFrameLocks noChangeAspect="1"/>
+            </wp:cNvGraphicFramePr>
+            <a:graphic>
+              <a:graphicData uri="http://schemas.openxmlformats.org/drawingml/2006/picture">
+                <pic:pic>
+                  <pic:nvPicPr>
+                    <pic:cNvPr id="0" name="purchase_usd.png"/>
+                    <pic:cNvPicPr/>
+                  </pic:nvPicPr>
+                  <pic:blipFill>
+                    <a:blip r:embed="rId20"/>
+                    <a:stretch>
+                      <a:fillRect/>
+                    </a:stretch>
+                  </pic:blipFill>
+                  <pic:spPr>
+                    <a:xfrm>
+                      <a:off x="0" y="0"/>
+                      <a:ext cx="5577840" cy="3542682"/>
+                    </a:xfrm>
+                    <a:prstGeom prst="rect"/>
+                  </pic:spPr>
+                </pic:pic>
+              </a:graphicData>
+            </a:graphic>
+          </wp:inline>
+        </w:drawing>
+      </w:r>
+    </w:p>
+    <w:p>
+      <w:pPr>
+        <w:jc w:val="center"/>
+      </w:pPr>
+      <w:r>
+        <w:rPr>
+          <w:i/>
+          <w:color w:val="555555"/>
+          <w:sz w:val="19"/>
+          <w:rFonts w:cs="Calibri" w:ascii="Calibri" w:hAnsi="Calibri"/>
+        </w:rPr>
+        <w:t>Figure 11 — Purchase order **P00002** from Gulf MedTrade — a USD order ($1,288) automatically valued in the company's SDG accounts.</w:t>
+      </w:r>
+    </w:p>
+    <w:p/>
+    <w:p>
       <w:r>
         <w:br w:type="page"/>
       </w:r>
@@ -3535,6 +4472,262 @@
         </w:tc>
       </w:tr>
     </w:tbl>
+    <w:p/>
+    <w:p>
+      <w:pPr>
+        <w:pStyle w:val="Heading2"/>
+      </w:pPr>
+      <w:r>
+        <w:rPr>
+          <w:rFonts w:cs="Calibri" w:ascii="Calibri" w:hAnsi="Calibri"/>
+        </w:rPr>
+        <w:t>7.3 Worked example — selling to Khartoum Teaching Hospital</w:t>
+      </w:r>
+    </w:p>
+    <w:p>
+      <w:r>
+        <w:rPr>
+          <w:rFonts w:cs="Calibri" w:ascii="Calibri" w:hAnsi="Calibri"/>
+        </w:rPr>
+        <w:t xml:space="preserve">This walkthrough follows the demo sales order </w:t>
+      </w:r>
+      <w:r>
+        <w:rPr>
+          <w:b/>
+          <w:rFonts w:cs="Calibri" w:ascii="Calibri" w:hAnsi="Calibri"/>
+        </w:rPr>
+        <w:t>S00001</w:t>
+      </w:r>
+      <w:r>
+        <w:rPr>
+          <w:rFonts w:cs="Calibri" w:ascii="Calibri" w:hAnsi="Calibri"/>
+        </w:rPr>
+        <w:t xml:space="preserve"> through to its posted invoice.</w:t>
+      </w:r>
+    </w:p>
+    <w:p>
+      <w:pPr>
+        <w:pStyle w:val="ListNumber"/>
+      </w:pPr>
+      <w:r>
+        <w:rPr>
+          <w:rFonts w:cs="Calibri" w:ascii="Calibri" w:hAnsi="Calibri"/>
+        </w:rPr>
+        <w:t xml:space="preserve">In </w:t>
+      </w:r>
+      <w:r>
+        <w:rPr>
+          <w:b/>
+          <w:rFonts w:cs="Calibri" w:ascii="Calibri" w:hAnsi="Calibri"/>
+        </w:rPr>
+        <w:t>Sales → Orders</w:t>
+      </w:r>
+      <w:r>
+        <w:rPr>
+          <w:rFonts w:cs="Calibri" w:ascii="Calibri" w:hAnsi="Calibri"/>
+        </w:rPr>
+        <w:t xml:space="preserve">, order </w:t>
+      </w:r>
+      <w:r>
+        <w:rPr>
+          <w:b/>
+          <w:rFonts w:cs="Calibri" w:ascii="Calibri" w:hAnsi="Calibri"/>
+        </w:rPr>
+        <w:t>S00001</w:t>
+      </w:r>
+      <w:r>
+        <w:rPr>
+          <w:rFonts w:cs="Calibri" w:ascii="Calibri" w:hAnsi="Calibri"/>
+        </w:rPr>
+        <w:t xml:space="preserve"> sells to </w:t>
+      </w:r>
+      <w:r>
+        <w:rPr>
+          <w:b/>
+          <w:rFonts w:cs="Calibri" w:ascii="Calibri" w:hAnsi="Calibri"/>
+        </w:rPr>
+        <w:t>Khartoum Teaching Hospital</w:t>
+      </w:r>
+      <w:r>
+        <w:rPr>
+          <w:rFonts w:cs="Calibri" w:ascii="Calibri" w:hAnsi="Calibri"/>
+        </w:rPr>
+        <w:t xml:space="preserve">: </w:t>
+      </w:r>
+      <w:r>
+        <w:rPr>
+          <w:b/>
+          <w:rFonts w:cs="Calibri" w:ascii="Calibri" w:hAnsi="Calibri"/>
+        </w:rPr>
+        <w:t>50 × Paracetamol 500mg</w:t>
+      </w:r>
+      <w:r>
+        <w:rPr>
+          <w:rFonts w:cs="Calibri" w:ascii="Calibri" w:hAnsi="Calibri"/>
+        </w:rPr>
+        <w:t xml:space="preserve">, </w:t>
+      </w:r>
+      <w:r>
+        <w:rPr>
+          <w:b/>
+          <w:rFonts w:cs="Calibri" w:ascii="Calibri" w:hAnsi="Calibri"/>
+        </w:rPr>
+        <w:t>20 × Surgical Gloves</w:t>
+      </w:r>
+      <w:r>
+        <w:rPr>
+          <w:rFonts w:cs="Calibri" w:ascii="Calibri" w:hAnsi="Calibri"/>
+        </w:rPr>
+        <w:t xml:space="preserve"> and </w:t>
+      </w:r>
+      <w:r>
+        <w:rPr>
+          <w:b/>
+          <w:rFonts w:cs="Calibri" w:ascii="Calibri" w:hAnsi="Calibri"/>
+        </w:rPr>
+        <w:t>30 × Syringe 5ml</w:t>
+      </w:r>
+      <w:r>
+        <w:rPr>
+          <w:rFonts w:cs="Calibri" w:ascii="Calibri" w:hAnsi="Calibri"/>
+        </w:rPr>
+        <w:t xml:space="preserve"> — all priced from the </w:t>
+      </w:r>
+      <w:r>
+        <w:rPr>
+          <w:b/>
+          <w:rFonts w:cs="Calibri" w:ascii="Calibri" w:hAnsi="Calibri"/>
+        </w:rPr>
+        <w:t>SDG</w:t>
+      </w:r>
+      <w:r>
+        <w:rPr>
+          <w:rFonts w:cs="Calibri" w:ascii="Calibri" w:hAnsi="Calibri"/>
+        </w:rPr>
+        <w:t xml:space="preserve"> price list.</w:t>
+      </w:r>
+    </w:p>
+    <w:p>
+      <w:pPr>
+        <w:pStyle w:val="ListNumber"/>
+      </w:pPr>
+      <w:r>
+        <w:rPr>
+          <w:rFonts w:cs="Calibri" w:ascii="Calibri" w:hAnsi="Calibri"/>
+        </w:rPr>
+        <w:t xml:space="preserve">Confirming the order creates a </w:t>
+      </w:r>
+      <w:r>
+        <w:rPr>
+          <w:b/>
+          <w:rFonts w:cs="Calibri" w:ascii="Calibri" w:hAnsi="Calibri"/>
+        </w:rPr>
+        <w:t>Delivery</w:t>
+      </w:r>
+      <w:r>
+        <w:rPr>
+          <w:rFonts w:cs="Calibri" w:ascii="Calibri" w:hAnsi="Calibri"/>
+        </w:rPr>
+        <w:t>; under FEFO the system reserves the soonest-to-expire lots and is validated to ship the goods.</w:t>
+      </w:r>
+    </w:p>
+    <w:p>
+      <w:pPr>
+        <w:pStyle w:val="ListNumber"/>
+      </w:pPr>
+      <w:r>
+        <w:rPr>
+          <w:b/>
+          <w:rFonts w:cs="Calibri" w:ascii="Calibri" w:hAnsi="Calibri"/>
+        </w:rPr>
+        <w:t>Create Invoice</w:t>
+      </w:r>
+      <w:r>
+        <w:rPr>
+          <w:rFonts w:cs="Calibri" w:ascii="Calibri" w:hAnsi="Calibri"/>
+        </w:rPr>
+        <w:t xml:space="preserve"> then posts </w:t>
+      </w:r>
+      <w:r>
+        <w:rPr>
+          <w:b/>
+          <w:rFonts w:cs="Calibri" w:ascii="Calibri" w:hAnsi="Calibri"/>
+        </w:rPr>
+        <w:t>INV/2026/00001</w:t>
+      </w:r>
+      <w:r>
+        <w:rPr>
+          <w:rFonts w:cs="Calibri" w:ascii="Calibri" w:hAnsi="Calibri"/>
+        </w:rPr>
+        <w:t xml:space="preserve"> for </w:t>
+      </w:r>
+      <w:r>
+        <w:rPr>
+          <w:b/>
+          <w:rFonts w:cs="Calibri" w:ascii="Calibri" w:hAnsi="Calibri"/>
+        </w:rPr>
+        <w:t>317,400 SDG</w:t>
+      </w:r>
+      <w:r>
+        <w:rPr>
+          <w:rFonts w:cs="Calibri" w:ascii="Calibri" w:hAnsi="Calibri"/>
+        </w:rPr>
+        <w:t xml:space="preserve"> (276,000 net + 41,400 VAT at 15%).</w:t>
+      </w:r>
+    </w:p>
+    <w:p>
+      <w:pPr>
+        <w:jc w:val="center"/>
+      </w:pPr>
+      <w:r>
+        <w:drawing>
+          <wp:inline xmlns:a="http://schemas.openxmlformats.org/drawingml/2006/main" xmlns:pic="http://schemas.openxmlformats.org/drawingml/2006/picture">
+            <wp:extent cx="5577840" cy="3542682"/>
+            <wp:docPr id="12" name="Picture 12"/>
+            <wp:cNvGraphicFramePr>
+              <a:graphicFrameLocks noChangeAspect="1"/>
+            </wp:cNvGraphicFramePr>
+            <a:graphic>
+              <a:graphicData uri="http://schemas.openxmlformats.org/drawingml/2006/picture">
+                <pic:pic>
+                  <pic:nvPicPr>
+                    <pic:cNvPr id="0" name="sale_order.png"/>
+                    <pic:cNvPicPr/>
+                  </pic:nvPicPr>
+                  <pic:blipFill>
+                    <a:blip r:embed="rId21"/>
+                    <a:stretch>
+                      <a:fillRect/>
+                    </a:stretch>
+                  </pic:blipFill>
+                  <pic:spPr>
+                    <a:xfrm>
+                      <a:off x="0" y="0"/>
+                      <a:ext cx="5577840" cy="3542682"/>
+                    </a:xfrm>
+                    <a:prstGeom prst="rect"/>
+                  </pic:spPr>
+                </pic:pic>
+              </a:graphicData>
+            </a:graphic>
+          </wp:inline>
+        </w:drawing>
+      </w:r>
+    </w:p>
+    <w:p>
+      <w:pPr>
+        <w:jc w:val="center"/>
+      </w:pPr>
+      <w:r>
+        <w:rPr>
+          <w:i/>
+          <w:color w:val="555555"/>
+          <w:sz w:val="19"/>
+          <w:rFonts w:cs="Calibri" w:ascii="Calibri" w:hAnsi="Calibri"/>
+        </w:rPr>
+        <w:t>Figure 12 — Sales order **S00001** for Khartoum Teaching Hospital, priced in SDG.</w:t>
+      </w:r>
+    </w:p>
     <w:p/>
     <w:p>
       <w:r>
@@ -3820,24 +5013,67 @@
     <w:p/>
     <w:p>
       <w:pPr>
-        <w:pStyle w:val="Heading2"/>
-      </w:pPr>
-      <w:r>
-        <w:rPr>
-          <w:rFonts w:cs="Calibri" w:ascii="Calibri" w:hAnsi="Calibri"/>
-        </w:rPr>
-        <w:t>8.2 Customer invoices and vendor bills</w:t>
+        <w:jc w:val="center"/>
+      </w:pPr>
+      <w:r>
+        <w:drawing>
+          <wp:inline xmlns:a="http://schemas.openxmlformats.org/drawingml/2006/main" xmlns:pic="http://schemas.openxmlformats.org/drawingml/2006/picture">
+            <wp:extent cx="5577840" cy="3542682"/>
+            <wp:docPr id="13" name="Picture 13"/>
+            <wp:cNvGraphicFramePr>
+              <a:graphicFrameLocks noChangeAspect="1"/>
+            </wp:cNvGraphicFramePr>
+            <a:graphic>
+              <a:graphicData uri="http://schemas.openxmlformats.org/drawingml/2006/picture">
+                <pic:pic>
+                  <pic:nvPicPr>
+                    <pic:cNvPr id="0" name="accounting.png"/>
+                    <pic:cNvPicPr/>
+                  </pic:nvPicPr>
+                  <pic:blipFill>
+                    <a:blip r:embed="rId22"/>
+                    <a:stretch>
+                      <a:fillRect/>
+                    </a:stretch>
+                  </pic:blipFill>
+                  <pic:spPr>
+                    <a:xfrm>
+                      <a:off x="0" y="0"/>
+                      <a:ext cx="5577840" cy="3542682"/>
+                    </a:xfrm>
+                    <a:prstGeom prst="rect"/>
+                  </pic:spPr>
+                </pic:pic>
+              </a:graphicData>
+            </a:graphic>
+          </wp:inline>
+        </w:drawing>
       </w:r>
     </w:p>
     <w:p>
       <w:pPr>
-        <w:pStyle w:val="ListBullet"/>
-      </w:pPr>
-      <w:r>
-        <w:rPr>
-          <w:rFonts w:cs="Calibri" w:ascii="Calibri" w:hAnsi="Calibri"/>
-        </w:rPr>
-        <w:t>Customer invoices are normally created from sales orders and posted from Accounting.</w:t>
+        <w:jc w:val="center"/>
+      </w:pPr>
+      <w:r>
+        <w:rPr>
+          <w:i/>
+          <w:color w:val="555555"/>
+          <w:sz w:val="19"/>
+          <w:rFonts w:cs="Calibri" w:ascii="Calibri" w:hAnsi="Calibri"/>
+        </w:rPr>
+        <w:t>Figure 13 — The Accounting dashboard — one card per journal (Customer Invoices, Vendor Bills, Bank, Cash) with quick actions.</w:t>
+      </w:r>
+    </w:p>
+    <w:p/>
+    <w:p>
+      <w:pPr>
+        <w:pStyle w:val="Heading2"/>
+      </w:pPr>
+      <w:r>
+        <w:rPr>
+          <w:rFonts w:cs="Calibri" w:ascii="Calibri" w:hAnsi="Calibri"/>
+        </w:rPr>
+        <w:t>8.2 Customer invoices and vendor bills</w:t>
       </w:r>
     </w:p>
     <w:p>
@@ -3848,7 +5084,7 @@
         <w:rPr>
           <w:rFonts w:cs="Calibri" w:ascii="Calibri" w:hAnsi="Calibri"/>
         </w:rPr>
-        <w:t>Vendor bills are created from purchase orders / receipts and posted before payment.</w:t>
+        <w:t>Customer invoices are normally created from sales orders and posted from Accounting.</w:t>
       </w:r>
     </w:p>
     <w:p>
@@ -3859,9 +5095,74 @@
         <w:rPr>
           <w:rFonts w:cs="Calibri" w:ascii="Calibri" w:hAnsi="Calibri"/>
         </w:rPr>
+        <w:t>Vendor bills are created from purchase orders / receipts and posted before payment.</w:t>
+      </w:r>
+    </w:p>
+    <w:p>
+      <w:pPr>
+        <w:pStyle w:val="ListBullet"/>
+      </w:pPr>
+      <w:r>
+        <w:rPr>
+          <w:rFonts w:cs="Calibri" w:ascii="Calibri" w:hAnsi="Calibri"/>
+        </w:rPr>
         <w:t>Each posted document generates the matching journal entries automatically.</w:t>
       </w:r>
     </w:p>
+    <w:p>
+      <w:pPr>
+        <w:jc w:val="center"/>
+      </w:pPr>
+      <w:r>
+        <w:drawing>
+          <wp:inline xmlns:a="http://schemas.openxmlformats.org/drawingml/2006/main" xmlns:pic="http://schemas.openxmlformats.org/drawingml/2006/picture">
+            <wp:extent cx="5577840" cy="3542682"/>
+            <wp:docPr id="14" name="Picture 14"/>
+            <wp:cNvGraphicFramePr>
+              <a:graphicFrameLocks noChangeAspect="1"/>
+            </wp:cNvGraphicFramePr>
+            <a:graphic>
+              <a:graphicData uri="http://schemas.openxmlformats.org/drawingml/2006/picture">
+                <pic:pic>
+                  <pic:nvPicPr>
+                    <pic:cNvPr id="0" name="customer_invoice.png"/>
+                    <pic:cNvPicPr/>
+                  </pic:nvPicPr>
+                  <pic:blipFill>
+                    <a:blip r:embed="rId23"/>
+                    <a:stretch>
+                      <a:fillRect/>
+                    </a:stretch>
+                  </pic:blipFill>
+                  <pic:spPr>
+                    <a:xfrm>
+                      <a:off x="0" y="0"/>
+                      <a:ext cx="5577840" cy="3542682"/>
+                    </a:xfrm>
+                    <a:prstGeom prst="rect"/>
+                  </pic:spPr>
+                </pic:pic>
+              </a:graphicData>
+            </a:graphic>
+          </wp:inline>
+        </w:drawing>
+      </w:r>
+    </w:p>
+    <w:p>
+      <w:pPr>
+        <w:jc w:val="center"/>
+      </w:pPr>
+      <w:r>
+        <w:rPr>
+          <w:i/>
+          <w:color w:val="555555"/>
+          <w:sz w:val="19"/>
+          <w:rFonts w:cs="Calibri" w:ascii="Calibri" w:hAnsi="Calibri"/>
+        </w:rPr>
+        <w:t>Figure 14 — Posted customer invoice **INV/2026/00001** in SDG, linked back to its sales order.</w:t>
+      </w:r>
+    </w:p>
+    <w:p/>
     <w:p>
       <w:pPr>
         <w:pStyle w:val="Heading2"/>

</xml_diff>